<commit_message>
Implemented Sep 15 2026 feedback
</commit_message>
<xml_diff>
--- a/docassemble/SmallEstateAffidavit/data/templates/instructions_sea.docx
+++ b/docassemble/SmallEstateAffidavit/data/templates/instructions_sea.docx
@@ -29,23 +29,25 @@
             <w:pPr>
               <w:rPr>
                 <w:rFonts w:ascii="Verdana" w:hAnsi="Verdana" w:cs="Arial"/>
+                <w:sz w:val="40"/>
+                <w:szCs w:val="40"/>
               </w:rPr>
             </w:pPr>
             <w:r>
               <w:rPr>
                 <w:rFonts w:ascii="Verdana" w:hAnsi="Verdana" w:cs="Arial"/>
                 <w:noProof/>
-                <w:sz w:val="32"/>
-                <w:szCs w:val="32"/>
+                <w:sz w:val="40"/>
+                <w:szCs w:val="40"/>
               </w:rPr>
               <w:drawing>
-                <wp:anchor distT="0" distB="0" distL="114300" distR="114300" simplePos="0" relativeHeight="251659264" behindDoc="0" locked="0" layoutInCell="1" allowOverlap="1" wp14:anchorId="3D6EE7CB" wp14:editId="62BF3E4C">
+                <wp:anchor distT="0" distB="0" distL="114300" distR="114300" simplePos="0" relativeHeight="251659264" behindDoc="0" locked="0" layoutInCell="1" allowOverlap="1" wp14:anchorId="3D6EE7CB" wp14:editId="64286F2A">
                   <wp:simplePos x="0" y="0"/>
                   <wp:positionH relativeFrom="column">
-                    <wp:posOffset>2540</wp:posOffset>
+                    <wp:posOffset>5406536</wp:posOffset>
                   </wp:positionH>
                   <wp:positionV relativeFrom="paragraph">
-                    <wp:posOffset>12700</wp:posOffset>
+                    <wp:posOffset>0</wp:posOffset>
                   </wp:positionV>
                   <wp:extent cx="1143000" cy="640715"/>
                   <wp:effectExtent l="0" t="0" r="0" b="6985"/>
@@ -91,6 +93,16 @@
                 </wp:anchor>
               </w:drawing>
             </w:r>
+            <w:r>
+              <w:rPr>
+                <w:rFonts w:ascii="Verdana" w:hAnsi="Verdana" w:cs="Arial"/>
+                <w:b/>
+                <w:bCs/>
+                <w:sz w:val="40"/>
+                <w:szCs w:val="40"/>
+              </w:rPr>
+              <w:t>Small Estate Affidavit</w:t>
+            </w:r>
           </w:p>
           <w:p>
             <w:pPr>
@@ -98,6 +110,15 @@
                 <w:rFonts w:ascii="Verdana" w:hAnsi="Verdana" w:cs="Arial"/>
                 <w:b/>
                 <w:bCs/>
+                <w:sz w:val="28"/>
+                <w:szCs w:val="28"/>
+              </w:rPr>
+            </w:pPr>
+          </w:p>
+          <w:p>
+            <w:pPr>
+              <w:rPr>
+                <w:rFonts w:ascii="Verdana" w:hAnsi="Verdana" w:cs="Arial"/>
                 <w:sz w:val="32"/>
                 <w:szCs w:val="32"/>
               </w:rPr>
@@ -105,22 +126,10 @@
             <w:r>
               <w:rPr>
                 <w:rFonts w:ascii="Verdana" w:hAnsi="Verdana" w:cs="Arial"/>
-                <w:b/>
-                <w:bCs/>
-                <w:sz w:val="32"/>
-                <w:szCs w:val="32"/>
-              </w:rPr>
-              <w:t xml:space="preserve">How to use a </w:t>
-            </w:r>
-            <w:r>
-              <w:rPr>
-                <w:rFonts w:ascii="Verdana" w:hAnsi="Verdana" w:cs="Arial"/>
-                <w:b/>
-                <w:bCs/>
-                <w:sz w:val="32"/>
-                <w:szCs w:val="32"/>
-              </w:rPr>
-              <w:t>Small Estate Affidavit</w:t>
+                <w:sz w:val="28"/>
+                <w:szCs w:val="28"/>
+              </w:rPr>
+              <w:t>Instructions</w:t>
             </w:r>
           </w:p>
         </w:tc>
@@ -190,15 +199,15 @@
                 <w:sz w:val="24"/>
                 <w:szCs w:val="24"/>
               </w:rPr>
-              <w:t>Make at least two copies of the completed affidavit. Attach a copy of the death certificate. Also attach a certified copy of the will that was filed if there is on</w:t>
-            </w:r>
-            <w:r>
-              <w:rPr>
-                <w:rFonts w:ascii="Verdana" w:hAnsi="Verdana" w:cs="Arial"/>
-                <w:sz w:val="24"/>
-                <w:szCs w:val="24"/>
-              </w:rPr>
-              <w:t>e</w:t>
+              <w:t xml:space="preserve">Make at least two copies of the completed affidavit. Attach a copy of the death certificate. </w:t>
+            </w:r>
+            <w:r>
+              <w:rPr>
+                <w:rFonts w:ascii="Verdana" w:hAnsi="Verdana" w:cs="Arial"/>
+                <w:sz w:val="24"/>
+                <w:szCs w:val="24"/>
+              </w:rPr>
+              <w:t>If there is a will that was filed, attach a certified copy</w:t>
             </w:r>
             <w:r>
               <w:rPr>
@@ -240,6 +249,14 @@
               </w:rPr>
               <w:t>.</w:t>
             </w:r>
+            <w:r>
+              <w:rPr>
+                <w:rFonts w:ascii="Verdana" w:hAnsi="Verdana" w:cs="Arial"/>
+                <w:sz w:val="24"/>
+                <w:szCs w:val="24"/>
+              </w:rPr>
+              <w:t xml:space="preserve"> You must pay each type of debt in the order listed on the affidavit.</w:t>
+            </w:r>
           </w:p>
           <w:p>
             <w:pPr>
@@ -248,22 +265,20 @@
               <w:rPr>
                 <w:rFonts w:ascii="Verdana" w:hAnsi="Verdana" w:cs="Arial"/>
                 <w:b/>
-                <w:sz w:val="16"/>
-                <w:szCs w:val="16"/>
+                <w:sz w:val="24"/>
+                <w:szCs w:val="24"/>
               </w:rPr>
             </w:pPr>
-          </w:p>
-          <w:p>
-            <w:pPr>
-              <w:pStyle w:val="NoSpacing"/>
-              <w:spacing w:after="40" w:line="360" w:lineRule="auto"/>
+            <w:r>
               <w:rPr>
                 <w:rFonts w:ascii="Verdana" w:hAnsi="Verdana" w:cs="Arial"/>
                 <w:b/>
                 <w:sz w:val="24"/>
                 <w:szCs w:val="24"/>
               </w:rPr>
-            </w:pPr>
+              <w:t>2. Gather and distribute {{</w:t>
+            </w:r>
+            <w:proofErr w:type="spellStart"/>
             <w:r>
               <w:rPr>
                 <w:rFonts w:ascii="Verdana" w:hAnsi="Verdana" w:cs="Arial"/>
@@ -271,9 +286,9 @@
                 <w:sz w:val="24"/>
                 <w:szCs w:val="24"/>
               </w:rPr>
-              <w:t>2. Gather and distribute {{</w:t>
-            </w:r>
-            <w:proofErr w:type="spellStart"/>
+              <w:t>decedent.name_full</w:t>
+            </w:r>
+            <w:proofErr w:type="spellEnd"/>
             <w:r>
               <w:rPr>
                 <w:rFonts w:ascii="Verdana" w:hAnsi="Verdana" w:cs="Arial"/>
@@ -281,37 +296,7 @@
                 <w:sz w:val="24"/>
                 <w:szCs w:val="24"/>
               </w:rPr>
-              <w:t>decedent.name_</w:t>
-            </w:r>
-            <w:proofErr w:type="gramStart"/>
-            <w:r>
-              <w:rPr>
-                <w:rFonts w:ascii="Verdana" w:hAnsi="Verdana" w:cs="Arial"/>
-                <w:b/>
-                <w:sz w:val="24"/>
-                <w:szCs w:val="24"/>
-              </w:rPr>
-              <w:t>full</w:t>
-            </w:r>
-            <w:proofErr w:type="spellEnd"/>
-            <w:r>
-              <w:rPr>
-                <w:rFonts w:ascii="Verdana" w:hAnsi="Verdana" w:cs="Arial"/>
-                <w:b/>
-                <w:sz w:val="24"/>
-                <w:szCs w:val="24"/>
-              </w:rPr>
-              <w:t>(</w:t>
-            </w:r>
-            <w:proofErr w:type="gramEnd"/>
-            <w:r>
-              <w:rPr>
-                <w:rFonts w:ascii="Verdana" w:hAnsi="Verdana" w:cs="Arial"/>
-                <w:b/>
-                <w:sz w:val="24"/>
-                <w:szCs w:val="24"/>
-              </w:rPr>
-              <w:t>)}}’s property</w:t>
+              <w:t>()}}’s property</w:t>
             </w:r>
           </w:p>
           <w:p>
@@ -367,25 +352,7 @@
                 <w:sz w:val="24"/>
                 <w:szCs w:val="24"/>
               </w:rPr>
-              <w:t xml:space="preserve">The person or corporation that has the </w:t>
-            </w:r>
-            <w:proofErr w:type="gramStart"/>
-            <w:r>
-              <w:rPr>
-                <w:rFonts w:ascii="Verdana" w:hAnsi="Verdana" w:cs="Arial"/>
-                <w:sz w:val="24"/>
-                <w:szCs w:val="24"/>
-              </w:rPr>
-              <w:t>decedent’s</w:t>
-            </w:r>
-            <w:proofErr w:type="gramEnd"/>
-            <w:r>
-              <w:rPr>
-                <w:rFonts w:ascii="Verdana" w:hAnsi="Verdana" w:cs="Arial"/>
-                <w:sz w:val="24"/>
-                <w:szCs w:val="24"/>
-              </w:rPr>
-              <w:t xml:space="preserve"> property must turn over the property after you give them the small estate affidavit. If they don’t, you can file a civil court claim to get the property</w:t>
+              <w:t>The person or corporation that has the decedent’s property must turn over the property after you give them the small estate affidavit. If they don’t, you can file a civil court claim to get the property</w:t>
             </w:r>
             <w:r>
               <w:rPr>
@@ -435,33 +402,148 @@
                 <w:sz w:val="24"/>
                 <w:szCs w:val="24"/>
               </w:rPr>
-              <w:t xml:space="preserve">(assets) </w:t>
-            </w:r>
-            <w:proofErr w:type="gramStart"/>
-            <w:r>
-              <w:rPr>
-                <w:rFonts w:ascii="Verdana" w:hAnsi="Verdana" w:cs="Arial"/>
-                <w:sz w:val="24"/>
-                <w:szCs w:val="24"/>
-              </w:rPr>
-              <w:t>%}</w:t>
-            </w:r>
-            <w:r>
-              <w:rPr>
-                <w:rFonts w:ascii="Verdana" w:hAnsi="Verdana" w:cs="Arial"/>
-                <w:sz w:val="24"/>
-                <w:szCs w:val="24"/>
-              </w:rPr>
-              <w:t>The</w:t>
-            </w:r>
-            <w:proofErr w:type="gramEnd"/>
-            <w:r>
-              <w:rPr>
-                <w:rFonts w:ascii="Verdana" w:hAnsi="Verdana" w:cs="Arial"/>
-                <w:sz w:val="24"/>
-                <w:szCs w:val="24"/>
-              </w:rPr>
-              <w:t xml:space="preserve"> Illinois Secretary of State’s office may require that you use their own small estate affidavit form for some vehicle transfers. You may need to copy the information from this form onto their form</w:t>
+              <w:t>(assets) %}</w:t>
+            </w:r>
+            <w:r>
+              <w:rPr>
+                <w:rFonts w:ascii="Verdana" w:hAnsi="Verdana" w:cs="Arial"/>
+                <w:sz w:val="24"/>
+                <w:szCs w:val="24"/>
+              </w:rPr>
+              <w:t>The Illinois Secretary of State’s office may require that you use their own small estate affidavit form for some vehicle transfers.</w:t>
+            </w:r>
+            <w:r>
+              <w:rPr>
+                <w:rFonts w:ascii="Verdana" w:hAnsi="Verdana" w:cs="Arial"/>
+                <w:sz w:val="24"/>
+                <w:szCs w:val="24"/>
+              </w:rPr>
+              <w:t xml:space="preserve"> You can find their form at </w:t>
+            </w:r>
+            <w:hyperlink r:id="rId8" w:history="1">
+              <w:r>
+                <w:rPr>
+                  <w:rStyle w:val="Hyperlink"/>
+                  <w:rFonts w:ascii="Verdana" w:hAnsi="Verdana" w:cs="Arial"/>
+                  <w:sz w:val="24"/>
+                  <w:szCs w:val="24"/>
+                </w:rPr>
+                <w:t>https://www.ilsos.gov/content/dam/publications/</w:t>
+              </w:r>
+            </w:hyperlink>
+            <w:r>
+              <w:rPr>
+                <w:rFonts w:ascii="Verdana" w:hAnsi="Verdana" w:cs="Arial"/>
+                <w:color w:val="0563C1"/>
+                <w:sz w:val="24"/>
+                <w:szCs w:val="24"/>
+                <w:u w:val="single"/>
+              </w:rPr>
+              <w:t xml:space="preserve"> </w:t>
+            </w:r>
+            <w:proofErr w:type="spellStart"/>
+            <w:r>
+              <w:rPr>
+                <w:rFonts w:ascii="Verdana" w:hAnsi="Verdana" w:cs="Arial"/>
+                <w:color w:val="0563C1"/>
+                <w:sz w:val="24"/>
+                <w:szCs w:val="24"/>
+                <w:u w:val="single"/>
+              </w:rPr>
+              <w:t>pdf_publications</w:t>
+            </w:r>
+            <w:proofErr w:type="spellEnd"/>
+            <w:r>
+              <w:rPr>
+                <w:rFonts w:ascii="Verdana" w:hAnsi="Verdana" w:cs="Arial"/>
+                <w:color w:val="0563C1"/>
+                <w:sz w:val="24"/>
+                <w:szCs w:val="24"/>
+                <w:u w:val="single"/>
+              </w:rPr>
+              <w:t>/rtopr31.pdf</w:t>
+            </w:r>
+            <w:r>
+              <w:rPr>
+                <w:rFonts w:ascii="Verdana" w:hAnsi="Verdana" w:cs="Arial"/>
+                <w:sz w:val="24"/>
+                <w:szCs w:val="24"/>
+              </w:rPr>
+              <w:t>.</w:t>
+            </w:r>
+            <w:r>
+              <w:rPr>
+                <w:rFonts w:ascii="Verdana" w:hAnsi="Verdana" w:cs="Arial"/>
+                <w:sz w:val="24"/>
+                <w:szCs w:val="24"/>
+              </w:rPr>
+              <w:t xml:space="preserve"> You may need to copy the information from this form onto their form</w:t>
+            </w:r>
+            <w:r>
+              <w:rPr>
+                <w:rFonts w:ascii="Verdana" w:hAnsi="Verdana" w:cs="Arial"/>
+                <w:sz w:val="24"/>
+                <w:szCs w:val="24"/>
+              </w:rPr>
+              <w:t>.</w:t>
+            </w:r>
+            <w:r>
+              <w:rPr>
+                <w:rFonts w:ascii="Verdana" w:hAnsi="Verdana" w:cs="Arial"/>
+                <w:sz w:val="24"/>
+                <w:szCs w:val="24"/>
+              </w:rPr>
+              <w:t xml:space="preserve"> </w:t>
+            </w:r>
+            <w:r>
+              <w:rPr>
+                <w:rFonts w:ascii="Verdana" w:hAnsi="Verdana" w:cs="Arial"/>
+                <w:sz w:val="24"/>
+                <w:szCs w:val="24"/>
+              </w:rPr>
+              <w:t xml:space="preserve">If you need to change the title of decedent's vehicle, you can </w:t>
+            </w:r>
+            <w:r>
+              <w:rPr>
+                <w:rFonts w:ascii="Verdana" w:hAnsi="Verdana" w:cs="Arial"/>
+                <w:sz w:val="24"/>
+                <w:szCs w:val="24"/>
+              </w:rPr>
+              <w:t>do so at</w:t>
+            </w:r>
+            <w:r>
+              <w:rPr>
+                <w:rFonts w:ascii="Verdana" w:hAnsi="Verdana" w:cs="Arial"/>
+                <w:sz w:val="24"/>
+                <w:szCs w:val="24"/>
+              </w:rPr>
+              <w:t xml:space="preserve"> the Secretary of State's </w:t>
+            </w:r>
+            <w:r>
+              <w:rPr>
+                <w:rFonts w:ascii="Verdana" w:hAnsi="Verdana" w:cs="Arial"/>
+                <w:sz w:val="24"/>
+                <w:szCs w:val="24"/>
+              </w:rPr>
+              <w:t>website</w:t>
+            </w:r>
+            <w:r>
+              <w:rPr>
+                <w:rFonts w:ascii="Verdana" w:hAnsi="Verdana" w:cs="Arial"/>
+                <w:sz w:val="24"/>
+                <w:szCs w:val="24"/>
+              </w:rPr>
+              <w:t xml:space="preserve">: </w:t>
+            </w:r>
+            <w:r>
+              <w:rPr>
+                <w:rFonts w:ascii="Verdana" w:hAnsi="Verdana" w:cs="Arial"/>
+                <w:color w:val="0563C1"/>
+                <w:sz w:val="24"/>
+                <w:szCs w:val="24"/>
+                <w:u w:val="single"/>
+              </w:rPr>
+              <w:t>https://www.ilsos.gov/departments/vehicles/title-and-registration/pert.html</w:t>
             </w:r>
             <w:r>
               <w:rPr>
@@ -493,33 +575,15 @@
                 <w:sz w:val="24"/>
                 <w:szCs w:val="24"/>
               </w:rPr>
-              <w:t xml:space="preserve">{% endif </w:t>
-            </w:r>
-            <w:proofErr w:type="gramStart"/>
-            <w:r>
-              <w:rPr>
-                <w:rFonts w:ascii="Verdana" w:hAnsi="Verdana" w:cs="Arial"/>
-                <w:sz w:val="24"/>
-                <w:szCs w:val="24"/>
-              </w:rPr>
-              <w:t>%}</w:t>
-            </w:r>
-            <w:r>
-              <w:rPr>
-                <w:rFonts w:ascii="Verdana" w:hAnsi="Verdana" w:cs="Arial"/>
-                <w:sz w:val="24"/>
-                <w:szCs w:val="24"/>
-              </w:rPr>
-              <w:t>{</w:t>
-            </w:r>
-            <w:proofErr w:type="gramEnd"/>
-            <w:r>
-              <w:rPr>
-                <w:rFonts w:ascii="Verdana" w:hAnsi="Verdana" w:cs="Arial"/>
-                <w:sz w:val="24"/>
-                <w:szCs w:val="24"/>
-              </w:rPr>
-              <w:t>{</w:t>
+              <w:t>{% endif %}</w:t>
+            </w:r>
+            <w:r>
+              <w:rPr>
+                <w:rFonts w:ascii="Verdana" w:hAnsi="Verdana" w:cs="Arial"/>
+                <w:sz w:val="24"/>
+                <w:szCs w:val="24"/>
+              </w:rPr>
+              <w:t>{{</w:t>
             </w:r>
             <w:proofErr w:type="spellStart"/>
             <w:r>
@@ -528,16 +592,7 @@
                 <w:sz w:val="24"/>
                 <w:szCs w:val="24"/>
               </w:rPr>
-              <w:t>decedent.name_</w:t>
-            </w:r>
-            <w:proofErr w:type="gramStart"/>
-            <w:r>
-              <w:rPr>
-                <w:rFonts w:ascii="Verdana" w:hAnsi="Verdana" w:cs="Arial"/>
-                <w:sz w:val="24"/>
-                <w:szCs w:val="24"/>
-              </w:rPr>
-              <w:t>full</w:t>
+              <w:t>decedent.name_full</w:t>
             </w:r>
             <w:proofErr w:type="spellEnd"/>
             <w:r>
@@ -546,16 +601,47 @@
                 <w:sz w:val="24"/>
                 <w:szCs w:val="24"/>
               </w:rPr>
-              <w:t>(</w:t>
-            </w:r>
-            <w:proofErr w:type="gramEnd"/>
-            <w:r>
-              <w:rPr>
-                <w:rFonts w:ascii="Verdana" w:hAnsi="Verdana" w:cs="Arial"/>
-                <w:sz w:val="24"/>
-                <w:szCs w:val="24"/>
-              </w:rPr>
-              <w:t>)}}’s property must first be used to pay off their debts listed on the affidavit. {{</w:t>
+              <w:t>()}}’s property must first be used to pay off their debts listed on the affidavit.</w:t>
+            </w:r>
+            <w:r>
+              <w:rPr>
+                <w:rFonts w:ascii="Verdana" w:hAnsi="Verdana" w:cs="Arial"/>
+                <w:sz w:val="24"/>
+                <w:szCs w:val="24"/>
+              </w:rPr>
+              <w:t xml:space="preserve"> E</w:t>
+            </w:r>
+            <w:r>
+              <w:rPr>
+                <w:rFonts w:ascii="Verdana" w:hAnsi="Verdana" w:cs="Arial"/>
+                <w:sz w:val="24"/>
+                <w:szCs w:val="24"/>
+              </w:rPr>
+              <w:t xml:space="preserve">ach type of debt </w:t>
+            </w:r>
+            <w:r>
+              <w:rPr>
+                <w:rFonts w:ascii="Verdana" w:hAnsi="Verdana" w:cs="Arial"/>
+                <w:sz w:val="24"/>
+                <w:szCs w:val="24"/>
+              </w:rPr>
+              <w:t xml:space="preserve">must be paid </w:t>
+            </w:r>
+            <w:r>
+              <w:rPr>
+                <w:rFonts w:ascii="Verdana" w:hAnsi="Verdana" w:cs="Arial"/>
+                <w:sz w:val="24"/>
+                <w:szCs w:val="24"/>
+              </w:rPr>
+              <w:t>in the order listed on the affidavit.</w:t>
+            </w:r>
+            <w:r>
+              <w:rPr>
+                <w:rFonts w:ascii="Verdana" w:hAnsi="Verdana" w:cs="Arial"/>
+                <w:sz w:val="24"/>
+                <w:szCs w:val="24"/>
+              </w:rPr>
+              <w:t xml:space="preserve"> {{</w:t>
             </w:r>
             <w:proofErr w:type="spellStart"/>
             <w:r>
@@ -564,16 +650,7 @@
                 <w:sz w:val="24"/>
                 <w:szCs w:val="24"/>
               </w:rPr>
-              <w:t>decedent.name_</w:t>
-            </w:r>
-            <w:proofErr w:type="gramStart"/>
-            <w:r>
-              <w:rPr>
-                <w:rFonts w:ascii="Verdana" w:hAnsi="Verdana" w:cs="Arial"/>
-                <w:sz w:val="24"/>
-                <w:szCs w:val="24"/>
-              </w:rPr>
-              <w:t>full</w:t>
+              <w:t>decedent.name_full</w:t>
             </w:r>
             <w:proofErr w:type="spellEnd"/>
             <w:r>
@@ -582,16 +659,7 @@
                 <w:sz w:val="24"/>
                 <w:szCs w:val="24"/>
               </w:rPr>
-              <w:t>(</w:t>
-            </w:r>
-            <w:proofErr w:type="gramEnd"/>
-            <w:r>
-              <w:rPr>
-                <w:rFonts w:ascii="Verdana" w:hAnsi="Verdana" w:cs="Arial"/>
-                <w:sz w:val="24"/>
-                <w:szCs w:val="24"/>
-              </w:rPr>
-              <w:t>)}}’s heirs will inherit what is left over.</w:t>
+              <w:t>()}}’s heirs will inherit what is left over.</w:t>
             </w:r>
           </w:p>
         </w:tc>
@@ -624,13 +692,6 @@
     </w:tbl>
     <w:p>
       <w:pPr>
-        <w:rPr>
-          <w:rFonts w:ascii="Verdana" w:hAnsi="Verdana"/>
-        </w:rPr>
-      </w:pPr>
-    </w:p>
-    <w:p>
-      <w:pPr>
         <w:spacing w:line="276" w:lineRule="auto"/>
         <w:rPr>
           <w:rFonts w:ascii="Verdana" w:hAnsi="Verdana"/>
@@ -648,12 +709,27 @@
           <w:color w:val="0563C1"/>
           <w:u w:val="single"/>
         </w:rPr>
-        <w:t>https://www.illinoislegalaid.org/legal-information/transferring-property-small-estate-affidavit</w:t>
+        <w:t>https://www.</w:t>
+      </w:r>
+      <w:r>
+        <w:rPr>
+          <w:rFonts w:ascii="Verdana" w:hAnsi="Verdana"/>
+          <w:color w:val="0563C1"/>
+          <w:u w:val="single"/>
+        </w:rPr>
+        <w:t>illinoislegalaid</w:t>
+      </w:r>
+      <w:r>
+        <w:rPr>
+          <w:rFonts w:ascii="Verdana" w:hAnsi="Verdana"/>
+          <w:color w:val="0563C1"/>
+          <w:u w:val="single"/>
+        </w:rPr>
+        <w:t>.org/legal-information/transferring-property-small-estate-affidavit</w:t>
       </w:r>
     </w:p>
-    <w:p/>
     <w:sectPr>
-      <w:footerReference w:type="default" r:id="rId8"/>
+      <w:footerReference w:type="default" r:id="rId9"/>
       <w:pgSz w:w="12240" w:h="15840"/>
       <w:pgMar w:top="720" w:right="720" w:bottom="720" w:left="720" w:header="720" w:footer="720" w:gutter="0"/>
       <w:cols w:space="720"/>
@@ -689,39 +765,17 @@
       <w:pStyle w:val="Footer"/>
       <w:jc w:val="center"/>
       <w:rPr>
-        <w:rFonts w:ascii="Arial" w:hAnsi="Arial" w:cs="Arial"/>
-        <w:b/>
-        <w:sz w:val="20"/>
-        <w:szCs w:val="20"/>
+        <w:rFonts w:ascii="Verdana" w:hAnsi="Verdana"/>
+        <w:bCs/>
       </w:rPr>
     </w:pPr>
     <w:r>
       <w:rPr>
-        <w:rFonts w:ascii="Arial" w:hAnsi="Arial" w:cs="Arial"/>
-        <w:b/>
-        <w:sz w:val="20"/>
-        <w:szCs w:val="20"/>
+        <w:rFonts w:ascii="Verdana" w:hAnsi="Verdana" w:cs="Arial"/>
+        <w:bCs/>
       </w:rPr>
-      <w:t>THESE INSTRUCTIONS ARE FOR YOUR PERSONAL USE ONLY.</w:t>
+      <w:t>Illinois Legal Aid Online – www.illinoislegalaid.org</w:t>
     </w:r>
-  </w:p>
-  <w:p>
-    <w:pPr>
-      <w:pStyle w:val="Footer"/>
-      <w:jc w:val="center"/>
-    </w:pPr>
-    <w:hyperlink r:id="rId1" w:history="1">
-      <w:r>
-        <w:rPr>
-          <w:rStyle w:val="Hyperlink"/>
-          <w:rFonts w:ascii="Arial" w:hAnsi="Arial" w:cs="Arial"/>
-          <w:b/>
-          <w:sz w:val="20"/>
-          <w:szCs w:val="20"/>
-        </w:rPr>
-        <w:t>www.illinoislegalaid.org</w:t>
-      </w:r>
-    </w:hyperlink>
   </w:p>
 </w:ftr>
 </file>

</xml_diff>

<commit_message>
Implemented Sep 29 2026 feedback
</commit_message>
<xml_diff>
--- a/docassemble/SmallEstateAffidavit/data/templates/instructions_sea.docx
+++ b/docassemble/SmallEstateAffidavit/data/templates/instructions_sea.docx
@@ -64,7 +64,7 @@
                           <pic:cNvPicPr/>
                         </pic:nvPicPr>
                         <pic:blipFill>
-                          <a:blip r:embed="rId7" cstate="print">
+                          <a:blip r:embed="rId8" cstate="print">
                             <a:extLst>
                               <a:ext uri="{28A0092B-C50C-407E-A947-70E740481C1C}">
                                 <a14:useLocalDpi xmlns:a14="http://schemas.microsoft.com/office/drawing/2010/main" val="0"/>
@@ -110,8 +110,8 @@
                 <w:rFonts w:ascii="Verdana" w:hAnsi="Verdana" w:cs="Arial"/>
                 <w:b/>
                 <w:bCs/>
-                <w:sz w:val="28"/>
-                <w:szCs w:val="28"/>
+                <w:sz w:val="16"/>
+                <w:szCs w:val="16"/>
               </w:rPr>
             </w:pPr>
           </w:p>
@@ -152,8 +152,8 @@
               <w:rPr>
                 <w:rFonts w:ascii="Verdana" w:hAnsi="Verdana" w:cs="Arial"/>
                 <w:b/>
-                <w:sz w:val="16"/>
-                <w:szCs w:val="16"/>
+                <w:sz w:val="6"/>
+                <w:szCs w:val="6"/>
               </w:rPr>
             </w:pPr>
           </w:p>
@@ -186,7 +186,7 @@
                 <w:numId w:val="3"/>
               </w:numPr>
               <w:spacing w:after="40" w:line="360" w:lineRule="auto"/>
-              <w:ind w:left="360"/>
+              <w:ind w:left="792"/>
               <w:rPr>
                 <w:rFonts w:ascii="Verdana" w:hAnsi="Verdana" w:cs="Arial"/>
                 <w:sz w:val="24"/>
@@ -226,7 +226,7 @@
                 <w:numId w:val="3"/>
               </w:numPr>
               <w:spacing w:after="40" w:line="360" w:lineRule="auto"/>
-              <w:ind w:left="360"/>
+              <w:ind w:left="792"/>
               <w:rPr>
                 <w:rFonts w:ascii="Verdana" w:hAnsi="Verdana" w:cs="Arial"/>
                 <w:sz w:val="24"/>
@@ -239,7 +239,49 @@
                 <w:sz w:val="24"/>
                 <w:szCs w:val="24"/>
               </w:rPr>
-              <w:t>Sign and notarize the affidavit. You must sign this document in front of a Notary Public. Remember that by signing the affidavit you promise to pay the decedent’s debts before giving any money to anyone else</w:t>
+              <w:t xml:space="preserve">Sign and notarize the affidavit. You must sign this document in front of a Notary Public. </w:t>
+            </w:r>
+            <w:r>
+              <w:rPr>
+                <w:rFonts w:ascii="Verdana" w:hAnsi="Verdana" w:cs="Arial"/>
+                <w:sz w:val="24"/>
+                <w:szCs w:val="24"/>
+              </w:rPr>
+              <w:t xml:space="preserve">Remember that by signing the affidavit you promise to pay </w:t>
+            </w:r>
+            <w:r>
+              <w:rPr>
+                <w:rFonts w:ascii="Verdana" w:hAnsi="Verdana" w:cs="Arial"/>
+                <w:sz w:val="24"/>
+                <w:szCs w:val="24"/>
+              </w:rPr>
+              <w:t>{{</w:t>
+            </w:r>
+            <w:proofErr w:type="spellStart"/>
+            <w:r>
+              <w:rPr>
+                <w:rFonts w:ascii="Verdana" w:hAnsi="Verdana" w:cs="Arial"/>
+                <w:sz w:val="24"/>
+                <w:szCs w:val="24"/>
+              </w:rPr>
+              <w:t>decedent.name_full</w:t>
+            </w:r>
+            <w:proofErr w:type="spellEnd"/>
+            <w:r>
+              <w:rPr>
+                <w:rFonts w:ascii="Verdana" w:hAnsi="Verdana" w:cs="Arial"/>
+                <w:sz w:val="24"/>
+                <w:szCs w:val="24"/>
+              </w:rPr>
+              <w:t>()}}’s</w:t>
+            </w:r>
+            <w:r>
+              <w:rPr>
+                <w:rFonts w:ascii="Verdana" w:hAnsi="Verdana" w:cs="Arial"/>
+                <w:sz w:val="24"/>
+                <w:szCs w:val="24"/>
+              </w:rPr>
+              <w:t xml:space="preserve"> debts and distribute their money and property in the order listed on the affidavit</w:t>
             </w:r>
             <w:r>
               <w:rPr>
@@ -248,14 +290,6 @@
                 <w:szCs w:val="24"/>
               </w:rPr>
               <w:t>.</w:t>
-            </w:r>
-            <w:r>
-              <w:rPr>
-                <w:rFonts w:ascii="Verdana" w:hAnsi="Verdana" w:cs="Arial"/>
-                <w:sz w:val="24"/>
-                <w:szCs w:val="24"/>
-              </w:rPr>
-              <w:t xml:space="preserve"> You must pay each type of debt in the order listed on the affidavit.</w:t>
             </w:r>
           </w:p>
           <w:p>
@@ -307,7 +341,7 @@
                 <w:numId w:val="4"/>
               </w:numPr>
               <w:spacing w:after="40" w:line="360" w:lineRule="auto"/>
-              <w:ind w:left="360"/>
+              <w:ind w:left="792"/>
               <w:rPr>
                 <w:rFonts w:ascii="Verdana" w:hAnsi="Verdana" w:cs="Arial"/>
                 <w:sz w:val="24"/>
@@ -339,7 +373,7 @@
                 <w:numId w:val="4"/>
               </w:numPr>
               <w:spacing w:after="40" w:line="360" w:lineRule="auto"/>
-              <w:ind w:left="360"/>
+              <w:ind w:left="792"/>
               <w:rPr>
                 <w:rFonts w:ascii="Verdana" w:hAnsi="Verdana" w:cs="Arial"/>
                 <w:sz w:val="24"/>
@@ -371,7 +405,7 @@
                 <w:numId w:val="4"/>
               </w:numPr>
               <w:spacing w:after="40" w:line="360" w:lineRule="auto"/>
-              <w:ind w:left="360"/>
+              <w:ind w:left="792"/>
               <w:rPr>
                 <w:rFonts w:ascii="Verdana" w:hAnsi="Verdana" w:cs="Arial"/>
                 <w:sz w:val="24"/>
@@ -420,7 +454,7 @@
               </w:rPr>
               <w:t xml:space="preserve"> You can find their form at </w:t>
             </w:r>
-            <w:hyperlink r:id="rId8" w:history="1">
+            <w:hyperlink r:id="rId9" w:history="1">
               <w:r>
                 <w:rPr>
                   <w:rStyle w:val="Hyperlink"/>
@@ -562,7 +596,7 @@
                 <w:numId w:val="4"/>
               </w:numPr>
               <w:spacing w:after="40" w:line="360" w:lineRule="auto"/>
-              <w:ind w:left="360"/>
+              <w:ind w:left="792"/>
               <w:rPr>
                 <w:rFonts w:ascii="Verdana" w:hAnsi="Verdana" w:cs="Arial"/>
                 <w:sz w:val="24"/>
@@ -609,31 +643,41 @@
                 <w:sz w:val="24"/>
                 <w:szCs w:val="24"/>
               </w:rPr>
-              <w:t xml:space="preserve"> E</w:t>
-            </w:r>
-            <w:r>
-              <w:rPr>
-                <w:rFonts w:ascii="Verdana" w:hAnsi="Verdana" w:cs="Arial"/>
-                <w:sz w:val="24"/>
-                <w:szCs w:val="24"/>
-              </w:rPr>
-              <w:t xml:space="preserve">ach type of debt </w:t>
-            </w:r>
-            <w:r>
-              <w:rPr>
-                <w:rFonts w:ascii="Verdana" w:hAnsi="Verdana" w:cs="Arial"/>
-                <w:sz w:val="24"/>
-                <w:szCs w:val="24"/>
-              </w:rPr>
-              <w:t xml:space="preserve">must be paid </w:t>
-            </w:r>
-            <w:r>
-              <w:rPr>
-                <w:rFonts w:ascii="Verdana" w:hAnsi="Verdana" w:cs="Arial"/>
-                <w:sz w:val="24"/>
-                <w:szCs w:val="24"/>
-              </w:rPr>
-              <w:t>in the order listed on the affidavit.</w:t>
+              <w:t xml:space="preserve"> </w:t>
+            </w:r>
+            <w:r>
+              <w:rPr>
+                <w:rFonts w:ascii="Verdana" w:hAnsi="Verdana" w:cs="Arial"/>
+                <w:sz w:val="24"/>
+                <w:szCs w:val="24"/>
+              </w:rPr>
+              <w:t>{{</w:t>
+            </w:r>
+            <w:proofErr w:type="spellStart"/>
+            <w:r>
+              <w:rPr>
+                <w:rFonts w:ascii="Verdana" w:hAnsi="Verdana" w:cs="Arial"/>
+                <w:sz w:val="24"/>
+                <w:szCs w:val="24"/>
+              </w:rPr>
+              <w:t>decedent.name_full</w:t>
+            </w:r>
+            <w:proofErr w:type="spellEnd"/>
+            <w:r>
+              <w:rPr>
+                <w:rFonts w:ascii="Verdana" w:hAnsi="Verdana" w:cs="Arial"/>
+                <w:sz w:val="24"/>
+                <w:szCs w:val="24"/>
+              </w:rPr>
+              <w:t>()}}’s debts must be paid and property must be distributed in the order listed on the affidavit</w:t>
+            </w:r>
+            <w:r>
+              <w:rPr>
+                <w:rFonts w:ascii="Verdana" w:hAnsi="Verdana" w:cs="Arial"/>
+                <w:sz w:val="24"/>
+                <w:szCs w:val="24"/>
+              </w:rPr>
+              <w:t>.</w:t>
             </w:r>
             <w:r>
               <w:rPr>
@@ -661,31 +705,6 @@
               </w:rPr>
               <w:t>()}}’s heirs will inherit what is left over.</w:t>
             </w:r>
-          </w:p>
-        </w:tc>
-      </w:tr>
-      <w:tr>
-        <w:tc>
-          <w:tcPr>
-            <w:tcW w:w="10800" w:type="dxa"/>
-            <w:tcBorders>
-              <w:top w:val="single" w:sz="4" w:space="0" w:color="auto"/>
-              <w:left w:val="nil"/>
-              <w:bottom w:val="nil"/>
-              <w:right w:val="nil"/>
-            </w:tcBorders>
-          </w:tcPr>
-          <w:p>
-            <w:pPr>
-              <w:pStyle w:val="NoSpacing"/>
-              <w:spacing w:after="40"/>
-              <w:rPr>
-                <w:rFonts w:ascii="Verdana" w:hAnsi="Verdana" w:cs="Arial"/>
-                <w:b/>
-                <w:sz w:val="24"/>
-                <w:szCs w:val="24"/>
-              </w:rPr>
-            </w:pPr>
           </w:p>
         </w:tc>
       </w:tr>
@@ -729,7 +748,7 @@
       </w:r>
     </w:p>
     <w:sectPr>
-      <w:footerReference w:type="default" r:id="rId9"/>
+      <w:footerReference w:type="default" r:id="rId10"/>
       <w:pgSz w:w="12240" w:h="15840"/>
       <w:pgMar w:top="720" w:right="720" w:bottom="720" w:left="720" w:header="720" w:footer="720" w:gutter="0"/>
       <w:cols w:space="720"/>
@@ -811,7 +830,7 @@
       <w:lvlText w:val=""/>
       <w:lvlJc w:val="left"/>
       <w:pPr>
-        <w:ind w:left="720" w:hanging="360"/>
+        <w:ind w:left="900" w:hanging="360"/>
       </w:pPr>
       <w:rPr>
         <w:rFonts w:ascii="Symbol" w:hAnsi="Symbol" w:hint="default"/>
@@ -823,7 +842,7 @@
       <w:lvlText w:val="%2."/>
       <w:lvlJc w:val="left"/>
       <w:pPr>
-        <w:ind w:left="1800" w:hanging="360"/>
+        <w:ind w:left="1980" w:hanging="360"/>
       </w:pPr>
     </w:lvl>
     <w:lvl w:ilvl="2" w:tplc="0409001B">
@@ -832,7 +851,7 @@
       <w:lvlText w:val="%3."/>
       <w:lvlJc w:val="right"/>
       <w:pPr>
-        <w:ind w:left="2520" w:hanging="180"/>
+        <w:ind w:left="2700" w:hanging="180"/>
       </w:pPr>
     </w:lvl>
     <w:lvl w:ilvl="3" w:tplc="0409000F" w:tentative="1">
@@ -841,7 +860,7 @@
       <w:lvlText w:val="%4."/>
       <w:lvlJc w:val="left"/>
       <w:pPr>
-        <w:ind w:left="3240" w:hanging="360"/>
+        <w:ind w:left="3420" w:hanging="360"/>
       </w:pPr>
     </w:lvl>
     <w:lvl w:ilvl="4" w:tplc="04090019" w:tentative="1">
@@ -850,7 +869,7 @@
       <w:lvlText w:val="%5."/>
       <w:lvlJc w:val="left"/>
       <w:pPr>
-        <w:ind w:left="3960" w:hanging="360"/>
+        <w:ind w:left="4140" w:hanging="360"/>
       </w:pPr>
     </w:lvl>
     <w:lvl w:ilvl="5" w:tplc="0409001B" w:tentative="1">
@@ -859,7 +878,7 @@
       <w:lvlText w:val="%6."/>
       <w:lvlJc w:val="right"/>
       <w:pPr>
-        <w:ind w:left="4680" w:hanging="180"/>
+        <w:ind w:left="4860" w:hanging="180"/>
       </w:pPr>
     </w:lvl>
     <w:lvl w:ilvl="6" w:tplc="0409000F" w:tentative="1">
@@ -868,7 +887,7 @@
       <w:lvlText w:val="%7."/>
       <w:lvlJc w:val="left"/>
       <w:pPr>
-        <w:ind w:left="5400" w:hanging="360"/>
+        <w:ind w:left="5580" w:hanging="360"/>
       </w:pPr>
     </w:lvl>
     <w:lvl w:ilvl="7" w:tplc="04090019" w:tentative="1">
@@ -877,7 +896,7 @@
       <w:lvlText w:val="%8."/>
       <w:lvlJc w:val="left"/>
       <w:pPr>
-        <w:ind w:left="6120" w:hanging="360"/>
+        <w:ind w:left="6300" w:hanging="360"/>
       </w:pPr>
     </w:lvl>
     <w:lvl w:ilvl="8" w:tplc="0409001B" w:tentative="1">
@@ -886,7 +905,7 @@
       <w:lvlText w:val="%9."/>
       <w:lvlJc w:val="right"/>
       <w:pPr>
-        <w:ind w:left="6840" w:hanging="180"/>
+        <w:ind w:left="7020" w:hanging="180"/>
       </w:pPr>
     </w:lvl>
   </w:abstractNum>
@@ -992,7 +1011,7 @@
       <w:lvlText w:val=""/>
       <w:lvlJc w:val="left"/>
       <w:pPr>
-        <w:ind w:left="810" w:hanging="360"/>
+        <w:ind w:left="1890" w:hanging="360"/>
       </w:pPr>
       <w:rPr>
         <w:rFonts w:ascii="Symbol" w:hAnsi="Symbol" w:hint="default"/>
@@ -1004,7 +1023,7 @@
       <w:lvlText w:val="%2."/>
       <w:lvlJc w:val="left"/>
       <w:pPr>
-        <w:ind w:left="3960" w:hanging="360"/>
+        <w:ind w:left="5040" w:hanging="360"/>
       </w:pPr>
     </w:lvl>
     <w:lvl w:ilvl="2" w:tplc="0409001B" w:tentative="1">
@@ -1013,7 +1032,7 @@
       <w:lvlText w:val="%3."/>
       <w:lvlJc w:val="right"/>
       <w:pPr>
-        <w:ind w:left="4680" w:hanging="180"/>
+        <w:ind w:left="5760" w:hanging="180"/>
       </w:pPr>
     </w:lvl>
     <w:lvl w:ilvl="3" w:tplc="0409000F" w:tentative="1">
@@ -1022,7 +1041,7 @@
       <w:lvlText w:val="%4."/>
       <w:lvlJc w:val="left"/>
       <w:pPr>
-        <w:ind w:left="5400" w:hanging="360"/>
+        <w:ind w:left="6480" w:hanging="360"/>
       </w:pPr>
     </w:lvl>
     <w:lvl w:ilvl="4" w:tplc="04090019" w:tentative="1">
@@ -1031,7 +1050,7 @@
       <w:lvlText w:val="%5."/>
       <w:lvlJc w:val="left"/>
       <w:pPr>
-        <w:ind w:left="6120" w:hanging="360"/>
+        <w:ind w:left="7200" w:hanging="360"/>
       </w:pPr>
     </w:lvl>
     <w:lvl w:ilvl="5" w:tplc="0409001B" w:tentative="1">
@@ -1040,7 +1059,7 @@
       <w:lvlText w:val="%6."/>
       <w:lvlJc w:val="right"/>
       <w:pPr>
-        <w:ind w:left="6840" w:hanging="180"/>
+        <w:ind w:left="7920" w:hanging="180"/>
       </w:pPr>
     </w:lvl>
     <w:lvl w:ilvl="6" w:tplc="0409000F" w:tentative="1">
@@ -1049,7 +1068,7 @@
       <w:lvlText w:val="%7."/>
       <w:lvlJc w:val="left"/>
       <w:pPr>
-        <w:ind w:left="7560" w:hanging="360"/>
+        <w:ind w:left="8640" w:hanging="360"/>
       </w:pPr>
     </w:lvl>
     <w:lvl w:ilvl="7" w:tplc="04090019" w:tentative="1">
@@ -1058,7 +1077,7 @@
       <w:lvlText w:val="%8."/>
       <w:lvlJc w:val="left"/>
       <w:pPr>
-        <w:ind w:left="8280" w:hanging="360"/>
+        <w:ind w:left="9360" w:hanging="360"/>
       </w:pPr>
     </w:lvl>
     <w:lvl w:ilvl="8" w:tplc="0409001B" w:tentative="1">
@@ -1067,7 +1086,7 @@
       <w:lvlText w:val="%9."/>
       <w:lvlJc w:val="right"/>
       <w:pPr>
-        <w:ind w:left="9000" w:hanging="180"/>
+        <w:ind w:left="10080" w:hanging="180"/>
       </w:pPr>
     </w:lvl>
   </w:abstractNum>
@@ -2664,4 +2683,16 @@
     </a:ext>
   </a:extLst>
 </a:theme>
+</file>
+
+<file path=customXml/item1.xml><?xml version="1.0" encoding="utf-8"?>
+<b:Sources xmlns:b="http://schemas.openxmlformats.org/officeDocument/2006/bibliography" xmlns="http://schemas.openxmlformats.org/officeDocument/2006/bibliography" SelectedStyle="\APASixthEditionOfficeOnline.xsl" StyleName="APA" Version="6"/>
+</file>
+
+<file path=customXml/itemProps1.xml><?xml version="1.0" encoding="utf-8"?>
+<ds:datastoreItem xmlns:ds="http://schemas.openxmlformats.org/officeDocument/2006/customXml" ds:itemID="{53EA8373-EA01-4925-ACCA-6CB1C9B09C99}">
+  <ds:schemaRefs>
+    <ds:schemaRef ds:uri="http://schemas.openxmlformats.org/officeDocument/2006/bibliography"/>
+  </ds:schemaRefs>
+</ds:datastoreItem>
 </file>
</xml_diff>